<commit_message>
ISO W10 sapuan form HR: HR-FRM-01, HR-FRM-02, HR-RPT-01
Lolos gerbang mesin W10 dan pemeriksa bahasa buta (semua skor >= 4).

Co-Authored-By: Claude Opus 5.5 <noreply@anthropic.com>
Claude-Session: https://claude.ai/code/session_01BhkCQM7h3krZb9kjY2Nate
</commit_message>
<xml_diff>
--- a/out/02_HR/SNX-HR-FRM-01 Employee Competency Matrix (Rev00 DRAFT).docx
+++ b/out/02_HR/SNX-HR-FRM-01 Employee Competency Matrix (Rev00 DRAFT).docx
@@ -217,6 +217,7 @@
     <w:p>
       <w:pPr>
         <w:pStyle w:val="Heading1"/>
+        <w:keepNext/>
         <w:widowControl w:val="0"/>
         <w:spacing w:line="240" w:lineRule="auto"/>
         <w:ind w:right="407" w:firstLine="0"/>
@@ -511,6 +512,10 @@
         <w:gridCol w:w="5850"/>
       </w:tblGrid>
       <w:tr>
+        <w:trPr>
+          <w:cantSplit/>
+          <w:tblHeader/>
+        </w:trPr>
         <w:tc>
           <w:tcPr>
             <w:tcW w:w="3150" w:type="dxa"/>
@@ -523,6 +528,7 @@
           </w:tcPr>
           <w:p>
             <w:pPr>
+              <w:keepNext/>
               <w:widowControl w:val="0"/>
               <w:pBdr>
                 <w:top w:val="nil"/>
@@ -563,6 +569,7 @@
           </w:tcPr>
           <w:p>
             <w:pPr>
+              <w:keepNext/>
               <w:widowControl w:val="0"/>
               <w:pBdr>
                 <w:top w:val="nil"/>
@@ -593,6 +600,9 @@
         </w:tc>
       </w:tr>
       <w:tr>
+        <w:trPr>
+          <w:cantSplit/>
+        </w:trPr>
         <w:tc>
           <w:tcPr>
             <w:tcW w:w="3150" w:type="dxa"/>
@@ -646,6 +656,9 @@
         </w:tc>
       </w:tr>
       <w:tr>
+        <w:trPr>
+          <w:cantSplit/>
+        </w:trPr>
         <w:tc>
           <w:tcPr>
             <w:tcW w:w="3150" w:type="dxa"/>
@@ -699,6 +712,9 @@
         </w:tc>
       </w:tr>
       <w:tr>
+        <w:trPr>
+          <w:cantSplit/>
+        </w:trPr>
         <w:tc>
           <w:tcPr>
             <w:tcW w:w="3150" w:type="dxa"/>
@@ -750,6 +766,9 @@
         </w:tc>
       </w:tr>
       <w:tr>
+        <w:trPr>
+          <w:cantSplit/>
+        </w:trPr>
         <w:tc>
           <w:tcPr>
             <w:tcW w:w="3150" w:type="dxa"/>
@@ -810,6 +829,9 @@
         </w:tc>
       </w:tr>
       <w:tr>
+        <w:trPr>
+          <w:cantSplit/>
+        </w:trPr>
         <w:tc>
           <w:tcPr>
             <w:tcW w:w="3150" w:type="dxa"/>
@@ -861,6 +883,9 @@
         </w:tc>
       </w:tr>
       <w:tr>
+        <w:trPr>
+          <w:cantSplit/>
+        </w:trPr>
         <w:tc>
           <w:tcPr>
             <w:tcW w:w="3150" w:type="dxa"/>
@@ -914,6 +939,9 @@
         </w:tc>
       </w:tr>
       <w:tr>
+        <w:trPr>
+          <w:cantSplit/>
+        </w:trPr>
         <w:tc>
           <w:tcPr>
             <w:tcW w:w="3150" w:type="dxa"/>
@@ -967,6 +995,9 @@
         </w:tc>
       </w:tr>
       <w:tr>
+        <w:trPr>
+          <w:cantSplit/>
+        </w:trPr>
         <w:tc>
           <w:tcPr>
             <w:tcW w:w="3150" w:type="dxa"/>
@@ -1020,6 +1051,9 @@
         </w:tc>
       </w:tr>
       <w:tr>
+        <w:trPr>
+          <w:cantSplit/>
+        </w:trPr>
         <w:tc>
           <w:tcPr>
             <w:tcW w:w="3150" w:type="dxa"/>
@@ -1073,6 +1107,9 @@
         </w:tc>
       </w:tr>
       <w:tr>
+        <w:trPr>
+          <w:cantSplit/>
+        </w:trPr>
         <w:tc>
           <w:tcPr>
             <w:tcW w:w="3150" w:type="dxa"/>
@@ -1126,6 +1163,9 @@
         </w:tc>
       </w:tr>
       <w:tr>
+        <w:trPr>
+          <w:cantSplit/>
+        </w:trPr>
         <w:tc>
           <w:tcPr>
             <w:tcW w:w="3150" w:type="dxa"/>
@@ -1207,6 +1247,7 @@
     <w:p>
       <w:pPr>
         <w:pStyle w:val="Heading1"/>
+        <w:keepNext/>
         <w:widowControl w:val="0"/>
         <w:spacing w:before="816" w:line="240" w:lineRule="auto"/>
         <w:ind w:right="407"/>
@@ -1243,6 +1284,10 @@
         <w:gridCol w:w="3010"/>
       </w:tblGrid>
       <w:tr>
+        <w:trPr>
+          <w:cantSplit/>
+          <w:tblHeader/>
+        </w:trPr>
         <w:tc>
           <w:tcPr>
             <w:tcW w:w="3009" w:type="dxa"/>
@@ -1255,6 +1300,7 @@
           </w:tcPr>
           <w:p>
             <w:pPr>
+              <w:keepNext/>
               <w:widowControl w:val="0"/>
               <w:spacing w:line="240" w:lineRule="auto"/>
               <w:jc w:val="center"/>
@@ -1288,6 +1334,7 @@
           </w:tcPr>
           <w:p>
             <w:pPr>
+              <w:keepNext/>
               <w:widowControl w:val="0"/>
               <w:spacing w:line="240" w:lineRule="auto"/>
               <w:jc w:val="center"/>
@@ -1321,6 +1368,7 @@
           </w:tcPr>
           <w:p>
             <w:pPr>
+              <w:keepNext/>
               <w:widowControl w:val="0"/>
               <w:spacing w:line="240" w:lineRule="auto"/>
               <w:jc w:val="center"/>
@@ -1344,6 +1392,9 @@
         </w:tc>
       </w:tr>
       <w:tr>
+        <w:trPr>
+          <w:cantSplit/>
+        </w:trPr>
         <w:tc>
           <w:tcPr>
             <w:tcW w:w="3009" w:type="dxa"/>
@@ -1392,6 +1443,9 @@
         </w:tc>
       </w:tr>
       <w:tr>
+        <w:trPr>
+          <w:cantSplit/>
+        </w:trPr>
         <w:tc>
           <w:tcPr>
             <w:tcW w:w="3009" w:type="dxa"/>
@@ -1463,6 +1517,9 @@
         </w:tc>
       </w:tr>
       <w:tr>
+        <w:trPr>
+          <w:cantSplit/>
+        </w:trPr>
         <w:tc>
           <w:tcPr>
             <w:tcW w:w="3009" w:type="dxa"/>
@@ -1537,6 +1594,7 @@
     <w:p>
       <w:pPr>
         <w:pStyle w:val="Heading1"/>
+        <w:keepNext/>
         <w:widowControl w:val="0"/>
         <w:spacing w:before="816" w:line="240" w:lineRule="auto"/>
         <w:ind w:right="407"/>
@@ -1578,6 +1636,10 @@
         <w:gridCol w:w="2235"/>
       </w:tblGrid>
       <w:tr>
+        <w:trPr>
+          <w:cantSplit/>
+          <w:tblHeader/>
+        </w:trPr>
         <w:tc>
           <w:tcPr>
             <w:tcW w:w="810" w:type="dxa"/>
@@ -1590,6 +1652,7 @@
           </w:tcPr>
           <w:p>
             <w:pPr>
+              <w:keepNext/>
               <w:widowControl w:val="0"/>
               <w:pBdr>
                 <w:top w:val="nil"/>
@@ -1630,6 +1693,7 @@
           </w:tcPr>
           <w:p>
             <w:pPr>
+              <w:keepNext/>
               <w:widowControl w:val="0"/>
               <w:spacing w:line="240" w:lineRule="auto"/>
               <w:jc w:val="center"/>
@@ -1663,6 +1727,7 @@
           </w:tcPr>
           <w:p>
             <w:pPr>
+              <w:keepNext/>
               <w:widowControl w:val="0"/>
               <w:pBdr>
                 <w:top w:val="nil"/>
@@ -1703,6 +1768,7 @@
           </w:tcPr>
           <w:p>
             <w:pPr>
+              <w:keepNext/>
               <w:widowControl w:val="0"/>
               <w:pBdr>
                 <w:top w:val="nil"/>
@@ -1733,6 +1799,9 @@
         </w:tc>
       </w:tr>
       <w:tr>
+        <w:trPr>
+          <w:cantSplit/>
+        </w:trPr>
         <w:tc>
           <w:tcPr>
             <w:tcW w:w="810" w:type="dxa"/>
@@ -1835,6 +1904,9 @@
         </w:tc>
       </w:tr>
       <w:tr>
+        <w:trPr>
+          <w:cantSplit/>
+        </w:trPr>
         <w:tc>
           <w:tcPr>
             <w:tcW w:w="810" w:type="dxa"/>
@@ -1937,6 +2009,9 @@
         </w:tc>
       </w:tr>
       <w:tr>
+        <w:trPr>
+          <w:cantSplit/>
+        </w:trPr>
         <w:tc>
           <w:tcPr>
             <w:tcW w:w="810" w:type="dxa"/>
@@ -2379,7 +2454,7 @@
           <w:sz w:val="24"/>
           <w:szCs w:val="24"/>
         </w:rPr>
-        <w:t xml:space="preserve">Form ini juga mencatat sertifikasi profesi atau vendor yang wajib bagi sebuah jabatan, menurut penetapan HR Lead atau persyaratan kontrak pelanggan.</w:t>
+        <w:t xml:space="preserve">Form ini juga mencatat sertifikasi profesi atau vendor yang wajib untuk suatu jabatan, berdasarkan penetapan HR Lead atau persyaratan kontrak pelanggan.</w:t>
       </w:r>
     </w:p>
     <w:p>
@@ -2421,6 +2496,7 @@
     </w:p>
     <w:p>
       <w:pPr>
+        <w:keepNext/>
         <w:pBdr>
           <w:top w:val="nil"/>
           <w:left w:val="nil"/>
@@ -2458,6 +2534,8 @@
       </w:tblGrid>
       <w:tr>
         <w:trPr>
+          <w:cantSplit/>
+          <w:tblHeader/>
           <w:jc w:val="center"/>
         </w:trPr>
         <w:tc>
@@ -2473,6 +2551,7 @@
           </w:tcPr>
           <w:p>
             <w:pPr>
+              <w:keepNext/>
               <w:jc w:val="center"/>
               <w:rPr>
                 <w:sz w:val="24"/>
@@ -2503,6 +2582,7 @@
           </w:tcPr>
           <w:p>
             <w:pPr>
+              <w:keepNext/>
               <w:jc w:val="center"/>
               <w:rPr>
                 <w:sz w:val="24"/>
@@ -2523,6 +2603,7 @@
       </w:tr>
       <w:tr>
         <w:trPr>
+          <w:cantSplit/>
           <w:jc w:val="center"/>
         </w:trPr>
         <w:tc>
@@ -2584,6 +2665,7 @@
       </w:tr>
       <w:tr>
         <w:trPr>
+          <w:cantSplit/>
           <w:jc w:val="center"/>
         </w:trPr>
         <w:tc>
@@ -2638,13 +2720,14 @@
                 <w:sz w:val="24"/>
                 <w:szCs w:val="24"/>
               </w:rPr>
-              <w:t>Ada di SNX-HR-FRM-02.</w:t>
+              <w:t>Diatur di SNX-HR-FRM-02.</w:t>
             </w:r>
           </w:p>
         </w:tc>
       </w:tr>
       <w:tr>
         <w:trPr>
+          <w:cantSplit/>
           <w:jc w:val="center"/>
         </w:trPr>
         <w:tc>
@@ -2699,13 +2782,14 @@
                 <w:sz w:val="24"/>
                 <w:szCs w:val="24"/>
               </w:rPr>
-              <w:t>Ada di SNX-HR-JA-01. Form ini hanya memuat standar per tingkatan.</w:t>
+              <w:t>Diatur di SNX-HR-JA-01. Form ini hanya memuat standar per tingkatan.</w:t>
             </w:r>
           </w:p>
         </w:tc>
       </w:tr>
       <w:tr>
         <w:trPr>
+          <w:cantSplit/>
           <w:jc w:val="center"/>
         </w:trPr>
         <w:tc>
@@ -2760,13 +2844,14 @@
                 <w:sz w:val="24"/>
                 <w:szCs w:val="24"/>
               </w:rPr>
-              <w:t>Ada di KPI Matrix, dokumen yang berdiri sendiri (SNX-HR-JA-01 butir 4.6).</w:t>
+              <w:t>Diatur di KPI Matrix, dokumen tersendiri (SNX-HR-JA-01 butir 4.6).</w:t>
             </w:r>
           </w:p>
         </w:tc>
       </w:tr>
       <w:tr>
         <w:trPr>
+          <w:cantSplit/>
           <w:jc w:val="center"/>
         </w:trPr>
         <w:tc>
@@ -2821,13 +2906,14 @@
                 <w:sz w:val="24"/>
                 <w:szCs w:val="24"/>
               </w:rPr>
-              <w:t>Menurut SNX-HR-JA-01 butir 4.7, masa ini ditentukan sesudah job evaluation. Form ini tidak memuatnya.</w:t>
+              <w:t>Ditentukan setelah job evaluation sesuai SNX-HR-JA-01 butir 4.7, sehingga tidak dimuat di form ini.</w:t>
             </w:r>
           </w:p>
         </w:tc>
       </w:tr>
       <w:tr>
         <w:trPr>
+          <w:cantSplit/>
           <w:jc w:val="center"/>
         </w:trPr>
         <w:tc>
@@ -2882,7 +2968,7 @@
                 <w:sz w:val="24"/>
                 <w:szCs w:val="24"/>
               </w:rPr>
-              <w:t>Berstatus USULAN tanpa pemegang di SNX-HR-ORG-01 (butir K-10). Jabatan itu masuk Tabel 1 sesudah disahkan.</w:t>
+              <w:t>Masih USULAN dan belum memiliki pemegang di SNX-HR-ORG-01 (butir K-10). Jabatan itu ditambahkan ke Tabel 1 setelah disahkan.</w:t>
             </w:r>
           </w:p>
         </w:tc>
@@ -2915,6 +3001,7 @@
     <w:p>
       <w:pPr>
         <w:pStyle w:val="Heading1"/>
+        <w:keepNext/>
         <w:numPr>
           <w:ilvl w:val="0"/>
           <w:numId w:val="7"/>
@@ -2940,6 +3027,8 @@
       </w:tblGrid>
       <w:tr>
         <w:trPr>
+          <w:cantSplit/>
+          <w:tblHeader/>
           <w:jc w:val="center"/>
         </w:trPr>
         <w:tc>
@@ -2955,6 +3044,7 @@
           </w:tcPr>
           <w:p>
             <w:pPr>
+              <w:keepNext/>
               <w:jc w:val="center"/>
               <w:rPr>
                 <w:sz w:val="24"/>
@@ -2985,6 +3075,7 @@
           </w:tcPr>
           <w:p>
             <w:pPr>
+              <w:keepNext/>
               <w:jc w:val="center"/>
               <w:rPr>
                 <w:sz w:val="24"/>
@@ -3005,6 +3096,7 @@
       </w:tr>
       <w:tr>
         <w:trPr>
+          <w:cantSplit/>
           <w:jc w:val="center"/>
         </w:trPr>
         <w:tc>
@@ -3066,6 +3158,7 @@
       </w:tr>
       <w:tr>
         <w:trPr>
+          <w:cantSplit/>
           <w:jc w:val="center"/>
         </w:trPr>
         <w:tc>
@@ -3127,6 +3220,7 @@
       </w:tr>
       <w:tr>
         <w:trPr>
+          <w:cantSplit/>
           <w:jc w:val="center"/>
         </w:trPr>
         <w:tc>
@@ -3181,13 +3275,14 @@
                 <w:sz w:val="24"/>
                 <w:szCs w:val="24"/>
               </w:rPr>
-              <w:t>Hal yang harus diketahui pemegang jabatan agar tugasnya dikerjakan dengan benar, misalnya prosedur kerja dan sistem yang dipakai.</w:t>
+              <w:t>Hal yang perlu diketahui agar tugas jabatan dikerjakan dengan benar, misalnya prosedur kerja dan sistem yang dipakai.</w:t>
             </w:r>
           </w:p>
         </w:tc>
       </w:tr>
       <w:tr>
         <w:trPr>
+          <w:cantSplit/>
           <w:jc w:val="center"/>
         </w:trPr>
         <w:tc>
@@ -3249,6 +3344,7 @@
       </w:tr>
       <w:tr>
         <w:trPr>
+          <w:cantSplit/>
           <w:jc w:val="center"/>
         </w:trPr>
         <w:tc>
@@ -3310,6 +3406,7 @@
       </w:tr>
       <w:tr>
         <w:trPr>
+          <w:cantSplit/>
           <w:jc w:val="center"/>
         </w:trPr>
         <w:tc>
@@ -3371,6 +3468,7 @@
       </w:tr>
       <w:tr>
         <w:trPr>
+          <w:cantSplit/>
           <w:jc w:val="center"/>
         </w:trPr>
         <w:tc>
@@ -3425,13 +3523,14 @@
                 <w:sz w:val="24"/>
                 <w:szCs w:val="24"/>
               </w:rPr>
-              <w:t>Kelompok jabatan di SNX-HR-ORG-01 yang kedudukannya sama dalam susunan organisasi. Dasar penetapannya ada di butir 4.3.</w:t>
+              <w:t>Kelompok jabatan di SNX-HR-ORG-01 yang kedudukannya setara dalam susunan organisasi.</w:t>
             </w:r>
           </w:p>
         </w:tc>
       </w:tr>
       <w:tr>
         <w:trPr>
+          <w:cantSplit/>
           <w:jc w:val="center"/>
         </w:trPr>
         <w:tc>
@@ -3493,6 +3592,7 @@
       </w:tr>
       <w:tr>
         <w:trPr>
+          <w:cantSplit/>
           <w:jc w:val="center"/>
         </w:trPr>
         <w:tc>
@@ -3547,13 +3647,14 @@
                 <w:sz w:val="24"/>
                 <w:szCs w:val="24"/>
               </w:rPr>
-              <w:t>Angka terendah pada skala di bagian Skala Penguasaan yang dapat diterima untuk satu kompetensi.</w:t>
+              <w:t>Angka terendah pada Skala Penguasaan yang masih dapat diterima untuk satu kompetensi.</w:t>
             </w:r>
           </w:p>
         </w:tc>
       </w:tr>
       <w:tr>
         <w:trPr>
+          <w:cantSplit/>
           <w:jc w:val="center"/>
         </w:trPr>
         <w:tc>
@@ -3615,6 +3716,7 @@
       </w:tr>
       <w:tr>
         <w:trPr>
+          <w:cantSplit/>
           <w:jc w:val="center"/>
         </w:trPr>
         <w:tc>
@@ -3733,7 +3835,7 @@
           <w:sz w:val="24"/>
           <w:szCs w:val="24"/>
         </w:rPr>
-        <w:t xml:space="preserve">4.1 Daftar jabatan, kode JA, dan nama jabatan di form ini mengikuti SNX-HR-ORG-01. Kompetensi teknis di SNX-HR-JA-01 mencakup keterampilan dan pengetahuan, dan kompetensi perilaku di sana sama dengan perilaku di form ini (USULAN).</w:t>
+        <w:t xml:space="preserve">4.1 Daftar jabatan, kode JA, dan nama jabatan di form ini mengikuti SNX-HR-ORG-01. Kompetensi teknis di SNX-HR-JA-01 dipetakan ke Keterampilan dan Pengetahuan, sedangkan kompetensi perilakunya dipetakan ke Perilaku (USULAN).</w:t>
       </w:r>
     </w:p>
     <w:p>
@@ -3757,7 +3859,7 @@
           <w:sz w:val="24"/>
           <w:szCs w:val="24"/>
         </w:rPr>
-        <w:t xml:space="preserve">4.2 Standar berlaku per tingkatan. HR Lead menetapkan satu tingkatan untuk setiap jabatan, dan pemegang jabatan pada tingkatan yang sama wajib memiliki kompetensi yang sama menurut Tabel 2.</w:t>
+        <w:t xml:space="preserve">4.2 Standar berlaku per tingkatan. HR Lead menetapkan satu tingkatan untuk setiap jabatan. Pemegang jabatan pada tingkatan yang sama wajib memiliki kompetensi yang sama sesuai Tabel 2.</w:t>
       </w:r>
     </w:p>
     <w:p>
@@ -3781,7 +3883,7 @@
           <w:sz w:val="24"/>
           <w:szCs w:val="24"/>
         </w:rPr>
-        <w:t xml:space="preserve">4.3 HR Lead menetapkan tingkatan dari jumlah garis lapor sampai Direktur Utama (JA-01), sama dengan ukuran di SNX-HR-SOP-12 bagian 3 (USULAN). SNX-HR-JA-01 tidak memuat grading. Bila garis lapor sebuah jabatan masih menunggu konfirmasi di SNX-HR-ORG-01, HRGA Officer menulis keterangan menunggu konfirmasi pada tingkatannya.</w:t>
+        <w:t xml:space="preserve">4.3 HR Lead menetapkan tingkatan dari jumlah garis lapor sampai Direktur Utama (JA-01), dengan ukuran yang sama seperti di SNX-HR-SOP-12 bagian 3 (USULAN). SNX-HR-JA-01 tidak memuat grading. Jika garis lapor sebuah jabatan masih menunggu konfirmasi di SNX-HR-ORG-01, HRGA Officer menulis keterangan menunggu konfirmasi di kolom Tingkatan jabatan itu.</w:t>
       </w:r>
     </w:p>
     <w:p>
@@ -3829,7 +3931,7 @@
           <w:sz w:val="24"/>
           <w:szCs w:val="24"/>
         </w:rPr>
-        <w:t xml:space="preserve">4.5 Menurut SNX-HR-JA-01 butir 4.7, sertifikasi profesi atau vendor wajib hanya bila ditetapkan di Competency Matrix atau bila kontrak pelanggan memuat persyaratannya. Form ini dibaca sebagai Competency Matrix itu (USULAN), dan HR Lead menetapkan sertifikasi wajib di Tabel 1. HRGA Officer menulis dasarnya di kolom Dasar sertifikasi: form ini atau kontrak pelanggan.</w:t>
+        <w:t xml:space="preserve">4.5 Sesuai SNX-HR-JA-01 butir 4.7, sertifikasi profesi atau vendor hanya wajib jika ditetapkan di Competency Matrix atau dipersyaratkan kontrak pelanggan. HR Lead menetapkan sertifikasi wajib di Tabel 1, dan HRGA Officer menulis dasarnya di kolom Dasar sertifikasi: form ini atau kontrak pelanggan. Form ini diperlakukan sebagai Competency Matrix tersebut (USULAN).</w:t>
       </w:r>
     </w:p>
     <w:p>
@@ -3853,7 +3955,7 @@
           <w:sz w:val="24"/>
           <w:szCs w:val="24"/>
         </w:rPr>
-        <w:t xml:space="preserve">4.6 Klasifikasi form ini RESTRICTED (Internal) menurut SNX-ISMS-PRO-01.</w:t>
+        <w:t xml:space="preserve">4.6 Klasifikasi form ini RESTRICTED (Internal) sesuai SNX-ISMS-PRO-01.</w:t>
       </w:r>
     </w:p>
     <w:p>
@@ -3871,6 +3973,7 @@
     </w:p>
     <w:p>
       <w:pPr>
+        <w:keepNext/>
         <w:pBdr>
           <w:top w:val="nil"/>
           <w:left w:val="nil"/>
@@ -3890,7 +3993,7 @@
           <w:sz w:val="24"/>
           <w:szCs w:val="24"/>
         </w:rPr>
-        <w:t xml:space="preserve">Pembagian tugas berikut berstatus (USULAN).</w:t>
+        <w:t xml:space="preserve">Pembagian tugas berikut belum diputus (USULAN).</w:t>
       </w:r>
     </w:p>
     <w:tbl>
@@ -3908,6 +4011,8 @@
       </w:tblGrid>
       <w:tr>
         <w:trPr>
+          <w:cantSplit/>
+          <w:tblHeader/>
           <w:jc w:val="center"/>
         </w:trPr>
         <w:tc>
@@ -3923,6 +4028,7 @@
           </w:tcPr>
           <w:p>
             <w:pPr>
+              <w:keepNext/>
               <w:jc w:val="center"/>
               <w:rPr>
                 <w:sz w:val="24"/>
@@ -3953,6 +4059,7 @@
           </w:tcPr>
           <w:p>
             <w:pPr>
+              <w:keepNext/>
               <w:jc w:val="center"/>
               <w:rPr>
                 <w:sz w:val="24"/>
@@ -3973,6 +4080,7 @@
       </w:tr>
       <w:tr>
         <w:trPr>
+          <w:cantSplit/>
           <w:jc w:val="center"/>
         </w:trPr>
         <w:tc>
@@ -4034,6 +4142,7 @@
       </w:tr>
       <w:tr>
         <w:trPr>
+          <w:cantSplit/>
           <w:jc w:val="center"/>
         </w:trPr>
         <w:tc>
@@ -4088,13 +4197,14 @@
                 <w:sz w:val="24"/>
                 <w:szCs w:val="24"/>
               </w:rPr>
-              <w:t>Mencatat penetapan HR Lead di Tabel 1 dan Tabel 2, dan memelihara daftar jabatan di Tabel 1 sesuai SNX-HR-ORG-01.</w:t>
+              <w:t>Mencatat penetapan HR Lead di Tabel 1 dan Tabel 2. Memelihara daftar jabatan di Tabel 1 sesuai SNX-HR-ORG-01.</w:t>
             </w:r>
           </w:p>
         </w:tc>
       </w:tr>
       <w:tr>
         <w:trPr>
+          <w:cantSplit/>
           <w:jc w:val="center"/>
         </w:trPr>
         <w:tc>
@@ -4149,7 +4259,7 @@
                 <w:sz w:val="24"/>
                 <w:szCs w:val="24"/>
               </w:rPr>
-              <w:t>Menyetujui form lewat blok Approved By.</w:t>
+              <w:t>Menyetujui form melalui blok Approved By.</w:t>
             </w:r>
           </w:p>
         </w:tc>
@@ -4194,6 +4304,7 @@
     </w:p>
     <w:p>
       <w:pPr>
+        <w:keepNext/>
         <w:pBdr>
           <w:top w:val="nil"/>
           <w:left w:val="nil"/>
@@ -4232,6 +4343,8 @@
       </w:tblGrid>
       <w:tr>
         <w:trPr>
+          <w:cantSplit/>
+          <w:tblHeader/>
           <w:jc w:val="center"/>
         </w:trPr>
         <w:tc>
@@ -4247,6 +4360,7 @@
           </w:tcPr>
           <w:p>
             <w:pPr>
+              <w:keepNext/>
               <w:jc w:val="center"/>
               <w:rPr>
                 <w:sz w:val="24"/>
@@ -4277,6 +4391,7 @@
           </w:tcPr>
           <w:p>
             <w:pPr>
+              <w:keepNext/>
               <w:jc w:val="center"/>
               <w:rPr>
                 <w:sz w:val="24"/>
@@ -4307,6 +4422,7 @@
           </w:tcPr>
           <w:p>
             <w:pPr>
+              <w:keepNext/>
               <w:jc w:val="center"/>
               <w:rPr>
                 <w:sz w:val="24"/>
@@ -4327,6 +4443,7 @@
       </w:tr>
       <w:tr>
         <w:trPr>
+          <w:cantSplit/>
           <w:jc w:val="center"/>
         </w:trPr>
         <w:tc>
@@ -4398,7 +4515,7 @@
           </w:tcPr>
           <w:p>
             <w:pPr>
-              <w:jc w:val="both"/>
+              <w:jc w:val="left"/>
               <w:rPr>
                 <w:sz w:val="24"/>
                 <w:szCs w:val="24"/>
@@ -4417,6 +4534,7 @@
       </w:tr>
       <w:tr>
         <w:trPr>
+          <w:cantSplit/>
           <w:jc w:val="center"/>
         </w:trPr>
         <w:tc>
@@ -4488,7 +4606,7 @@
           </w:tcPr>
           <w:p>
             <w:pPr>
-              <w:jc w:val="both"/>
+              <w:jc w:val="left"/>
               <w:rPr>
                 <w:sz w:val="24"/>
                 <w:szCs w:val="24"/>
@@ -4507,6 +4625,7 @@
       </w:tr>
       <w:tr>
         <w:trPr>
+          <w:cantSplit/>
           <w:jc w:val="center"/>
         </w:trPr>
         <w:tc>
@@ -4578,7 +4697,7 @@
           </w:tcPr>
           <w:p>
             <w:pPr>
-              <w:jc w:val="both"/>
+              <w:jc w:val="left"/>
               <w:rPr>
                 <w:sz w:val="24"/>
                 <w:szCs w:val="24"/>
@@ -4597,6 +4716,7 @@
       </w:tr>
       <w:tr>
         <w:trPr>
+          <w:cantSplit/>
           <w:jc w:val="center"/>
         </w:trPr>
         <w:tc>
@@ -4668,7 +4788,7 @@
           </w:tcPr>
           <w:p>
             <w:pPr>
-              <w:jc w:val="both"/>
+              <w:jc w:val="left"/>
               <w:rPr>
                 <w:sz w:val="24"/>
                 <w:szCs w:val="24"/>
@@ -4744,7 +4864,7 @@
           <w:sz w:val="24"/>
           <w:szCs w:val="24"/>
         </w:rPr>
-        <w:t xml:space="preserve">7.1 HRGA Officer mencocokkan daftar jabatan di Tabel 1 dengan SNX-HR-ORG-01.</w:t>
+        <w:t xml:space="preserve">7.1 Cocokkan daftar jabatan di Tabel 1 dengan SNX-HR-ORG-01.</w:t>
       </w:r>
     </w:p>
     <w:p>
@@ -4768,7 +4888,7 @@
           <w:sz w:val="24"/>
           <w:szCs w:val="24"/>
         </w:rPr>
-        <w:t xml:space="preserve">7.2 HRGA Officer menambah satu baris di Tabel 1 untuk setiap jabatan baru yang disahkan di SNX-HR-ORG-01.</w:t>
+        <w:t xml:space="preserve">7.2 Tambahkan satu baris di Tabel 1 untuk setiap jabatan baru yang disahkan di SNX-HR-ORG-01.</w:t>
       </w:r>
     </w:p>
     <w:p>
@@ -4792,7 +4912,7 @@
           <w:sz w:val="24"/>
           <w:szCs w:val="24"/>
         </w:rPr>
-        <w:t xml:space="preserve">7.3 HRGA Officer mencatat tingkatan setiap jabatan di kolom Tingkatan Tabel 1, sesuai penetapan HR Lead menurut butir 4.3.</w:t>
+        <w:t xml:space="preserve">7.3 Isi kolom Tingkatan di Tabel 1 sesuai penetapan HR Lead (butir 4.3).</w:t>
       </w:r>
     </w:p>
     <w:p>
@@ -4816,7 +4936,7 @@
           <w:sz w:val="24"/>
           <w:szCs w:val="24"/>
         </w:rPr>
-        <w:t xml:space="preserve">7.4 HRGA Officer mencatat sertifikasi yang diwajibkan dan dasarnya di Tabel 1, sesuai penetapan HR Lead menurut butir 4.5. HRGA Officer mengosongkan kedua kolom itu bila jabatan tidak mewajibkan sertifikasi.</w:t>
+        <w:t xml:space="preserve">7.4 Isi kolom sertifikasi yang diwajibkan dan kolom Dasar sertifikasi di Tabel 1 sesuai penetapan HR Lead (butir 4.5). Kosongkan kedua kolom itu jika tidak ada sertifikasi wajib untuk jabatan tersebut.</w:t>
       </w:r>
     </w:p>
     <w:p>
@@ -4840,7 +4960,7 @@
           <w:sz w:val="24"/>
           <w:szCs w:val="24"/>
         </w:rPr>
-        <w:t xml:space="preserve">7.5 HRGA Officer menulis satu baris di Tabel 2 untuk setiap tingkatan, dengan tulisan tingkatan yang sama seperti di Tabel 1.</w:t>
+        <w:t xml:space="preserve">7.5 Tulis satu baris di Tabel 2 untuk setiap tingkatan, dengan penulisan tingkatan yang sama seperti di Tabel 1.</w:t>
       </w:r>
     </w:p>
     <w:p>
@@ -4864,7 +4984,7 @@
           <w:sz w:val="24"/>
           <w:szCs w:val="24"/>
         </w:rPr>
-        <w:t xml:space="preserve">7.6 HRGA Officer mencatat kompetensi teknis jabatan pada tingkatan itu di kolom Keterampilan dan Pengetahuan, dan kompetensi perilakunya di kolom Perilaku, sesuai penetapan HR Lead dari SNX-HR-JA-01.</w:t>
+        <w:t xml:space="preserve">7.6 Isi kompetensi teknis tingkatan itu di kolom Keterampilan dan Pengetahuan, lalu kompetensi perilakunya di kolom Perilaku, sesuai penetapan HR Lead dari SNX-HR-JA-01.</w:t>
       </w:r>
     </w:p>
     <w:p>
@@ -4888,7 +5008,7 @@
           <w:sz w:val="24"/>
           <w:szCs w:val="24"/>
         </w:rPr>
-        <w:t xml:space="preserve">7.7 HRGA Officer menulis setiap kompetensi pada baris sendiri di dalam sel, dengan bentuk nama kompetensi (angka skala).</w:t>
+        <w:t xml:space="preserve">7.7 Tulis setiap kompetensi pada baris tersendiri di dalam sel, dengan format nama kompetensi (angka skala).</w:t>
       </w:r>
     </w:p>
     <w:p>
@@ -4912,7 +5032,7 @@
           <w:sz w:val="24"/>
           <w:szCs w:val="24"/>
         </w:rPr>
-        <w:t xml:space="preserve">7.8 HRGA Officer membiarkan kosong sel yang belum ditetapkan HR Lead.</w:t>
+        <w:t xml:space="preserve">7.8 Kosongkan sel yang belum ditetapkan HR Lead.</w:t>
       </w:r>
     </w:p>
     <w:p>
@@ -4936,7 +5056,7 @@
           <w:sz w:val="24"/>
           <w:szCs w:val="24"/>
         </w:rPr>
-        <w:t xml:space="preserve">7.9 HR Lead memeriksa isi Tabel 1 dan Tabel 2, lalu menyerahkannya ke Direktur Utama untuk disetujui.</w:t>
+        <w:t xml:space="preserve">7.9 Setelah terisi, Tabel 1 dan Tabel 2 diperiksa HR Lead, lalu diserahkan ke Direktur Utama untuk disetujui.</w:t>
       </w:r>
     </w:p>
     <w:p>
@@ -4973,12 +5093,13 @@
           <w:sz w:val="24"/>
           <w:szCs w:val="24"/>
         </w:rPr>
-        <w:t xml:space="preserve">Kolom Kode dan Jabatan mengikuti SNX-HR-ORG-01. Pengisian kolom lain mengikuti butir 7.3 sampai 7.7.</w:t>
+        <w:t xml:space="preserve">Kolom Kode dan Jabatan mengikuti SNX-HR-ORG-01.</w:t>
       </w:r>
     </w:p>
     <w:p>
       <w:pPr>
         <w:pStyle w:val="Heading2"/>
+        <w:keepNext/>
         <w:numPr>
           <w:ilvl w:val="1"/>
           <w:numId w:val="7"/>
@@ -5009,6 +5130,8 @@
       </w:tblGrid>
       <w:tr>
         <w:trPr>
+          <w:cantSplit/>
+          <w:tblHeader/>
           <w:jc w:val="center"/>
         </w:trPr>
         <w:tc>
@@ -5024,6 +5147,7 @@
           </w:tcPr>
           <w:p>
             <w:pPr>
+              <w:keepNext/>
               <w:jc w:val="center"/>
               <w:rPr>
                 <w:sz w:val="24"/>
@@ -5054,6 +5178,7 @@
           </w:tcPr>
           <w:p>
             <w:pPr>
+              <w:keepNext/>
               <w:jc w:val="center"/>
               <w:rPr>
                 <w:sz w:val="24"/>
@@ -5084,6 +5209,7 @@
           </w:tcPr>
           <w:p>
             <w:pPr>
+              <w:keepNext/>
               <w:jc w:val="center"/>
               <w:rPr>
                 <w:sz w:val="24"/>
@@ -5114,6 +5240,7 @@
           </w:tcPr>
           <w:p>
             <w:pPr>
+              <w:keepNext/>
               <w:jc w:val="center"/>
               <w:rPr>
                 <w:sz w:val="24"/>
@@ -5144,6 +5271,7 @@
           </w:tcPr>
           <w:p>
             <w:pPr>
+              <w:keepNext/>
               <w:jc w:val="center"/>
               <w:rPr>
                 <w:sz w:val="24"/>
@@ -5164,6 +5292,7 @@
       </w:tr>
       <w:tr>
         <w:trPr>
+          <w:cantSplit/>
           <w:jc w:val="center"/>
         </w:trPr>
         <w:tc>
@@ -5235,7 +5364,7 @@
           </w:tcPr>
           <w:p>
             <w:pPr>
-              <w:jc w:val="both"/>
+              <w:jc w:val="left"/>
               <w:rPr>
                 <w:sz w:val="24"/>
                 <w:szCs w:val="24"/>
@@ -5263,7 +5392,7 @@
           </w:tcPr>
           <w:p>
             <w:pPr>
-              <w:jc w:val="both"/>
+              <w:jc w:val="left"/>
               <w:rPr>
                 <w:sz w:val="24"/>
                 <w:szCs w:val="24"/>
@@ -5291,7 +5420,7 @@
           </w:tcPr>
           <w:p>
             <w:pPr>
-              <w:jc w:val="both"/>
+              <w:jc w:val="left"/>
               <w:rPr>
                 <w:sz w:val="24"/>
                 <w:szCs w:val="24"/>
@@ -5309,6 +5438,7 @@
       </w:tr>
       <w:tr>
         <w:trPr>
+          <w:cantSplit/>
           <w:jc w:val="center"/>
         </w:trPr>
         <w:tc>
@@ -5380,7 +5510,7 @@
           </w:tcPr>
           <w:p>
             <w:pPr>
-              <w:jc w:val="both"/>
+              <w:jc w:val="left"/>
               <w:rPr>
                 <w:sz w:val="24"/>
                 <w:szCs w:val="24"/>
@@ -5408,7 +5538,7 @@
           </w:tcPr>
           <w:p>
             <w:pPr>
-              <w:jc w:val="both"/>
+              <w:jc w:val="left"/>
               <w:rPr>
                 <w:sz w:val="24"/>
                 <w:szCs w:val="24"/>
@@ -5436,7 +5566,7 @@
           </w:tcPr>
           <w:p>
             <w:pPr>
-              <w:jc w:val="both"/>
+              <w:jc w:val="left"/>
               <w:rPr>
                 <w:sz w:val="24"/>
                 <w:szCs w:val="24"/>
@@ -5454,6 +5584,7 @@
       </w:tr>
       <w:tr>
         <w:trPr>
+          <w:cantSplit/>
           <w:jc w:val="center"/>
         </w:trPr>
         <w:tc>
@@ -5525,7 +5656,7 @@
           </w:tcPr>
           <w:p>
             <w:pPr>
-              <w:jc w:val="both"/>
+              <w:jc w:val="left"/>
               <w:rPr>
                 <w:sz w:val="24"/>
                 <w:szCs w:val="24"/>
@@ -5553,7 +5684,7 @@
           </w:tcPr>
           <w:p>
             <w:pPr>
-              <w:jc w:val="both"/>
+              <w:jc w:val="left"/>
               <w:rPr>
                 <w:sz w:val="24"/>
                 <w:szCs w:val="24"/>
@@ -5581,7 +5712,7 @@
           </w:tcPr>
           <w:p>
             <w:pPr>
-              <w:jc w:val="both"/>
+              <w:jc w:val="left"/>
               <w:rPr>
                 <w:sz w:val="24"/>
                 <w:szCs w:val="24"/>
@@ -5599,6 +5730,7 @@
       </w:tr>
       <w:tr>
         <w:trPr>
+          <w:cantSplit/>
           <w:jc w:val="center"/>
         </w:trPr>
         <w:tc>
@@ -5670,7 +5802,7 @@
           </w:tcPr>
           <w:p>
             <w:pPr>
-              <w:jc w:val="both"/>
+              <w:jc w:val="left"/>
               <w:rPr>
                 <w:sz w:val="24"/>
                 <w:szCs w:val="24"/>
@@ -5698,7 +5830,7 @@
           </w:tcPr>
           <w:p>
             <w:pPr>
-              <w:jc w:val="both"/>
+              <w:jc w:val="left"/>
               <w:rPr>
                 <w:sz w:val="24"/>
                 <w:szCs w:val="24"/>
@@ -5726,7 +5858,7 @@
           </w:tcPr>
           <w:p>
             <w:pPr>
-              <w:jc w:val="both"/>
+              <w:jc w:val="left"/>
               <w:rPr>
                 <w:sz w:val="24"/>
                 <w:szCs w:val="24"/>
@@ -5744,6 +5876,7 @@
       </w:tr>
       <w:tr>
         <w:trPr>
+          <w:cantSplit/>
           <w:jc w:val="center"/>
         </w:trPr>
         <w:tc>
@@ -5815,7 +5948,7 @@
           </w:tcPr>
           <w:p>
             <w:pPr>
-              <w:jc w:val="both"/>
+              <w:jc w:val="left"/>
               <w:rPr>
                 <w:sz w:val="24"/>
                 <w:szCs w:val="24"/>
@@ -5843,7 +5976,7 @@
           </w:tcPr>
           <w:p>
             <w:pPr>
-              <w:jc w:val="both"/>
+              <w:jc w:val="left"/>
               <w:rPr>
                 <w:sz w:val="24"/>
                 <w:szCs w:val="24"/>
@@ -5871,7 +6004,7 @@
           </w:tcPr>
           <w:p>
             <w:pPr>
-              <w:jc w:val="both"/>
+              <w:jc w:val="left"/>
               <w:rPr>
                 <w:sz w:val="24"/>
                 <w:szCs w:val="24"/>
@@ -5889,6 +6022,7 @@
       </w:tr>
       <w:tr>
         <w:trPr>
+          <w:cantSplit/>
           <w:jc w:val="center"/>
         </w:trPr>
         <w:tc>
@@ -5960,7 +6094,7 @@
           </w:tcPr>
           <w:p>
             <w:pPr>
-              <w:jc w:val="both"/>
+              <w:jc w:val="left"/>
               <w:rPr>
                 <w:sz w:val="24"/>
                 <w:szCs w:val="24"/>
@@ -5988,7 +6122,7 @@
           </w:tcPr>
           <w:p>
             <w:pPr>
-              <w:jc w:val="both"/>
+              <w:jc w:val="left"/>
               <w:rPr>
                 <w:sz w:val="24"/>
                 <w:szCs w:val="24"/>
@@ -6016,7 +6150,7 @@
           </w:tcPr>
           <w:p>
             <w:pPr>
-              <w:jc w:val="both"/>
+              <w:jc w:val="left"/>
               <w:rPr>
                 <w:sz w:val="24"/>
                 <w:szCs w:val="24"/>
@@ -6034,6 +6168,7 @@
       </w:tr>
       <w:tr>
         <w:trPr>
+          <w:cantSplit/>
           <w:jc w:val="center"/>
         </w:trPr>
         <w:tc>
@@ -6105,7 +6240,7 @@
           </w:tcPr>
           <w:p>
             <w:pPr>
-              <w:jc w:val="both"/>
+              <w:jc w:val="left"/>
               <w:rPr>
                 <w:sz w:val="24"/>
                 <w:szCs w:val="24"/>
@@ -6133,7 +6268,7 @@
           </w:tcPr>
           <w:p>
             <w:pPr>
-              <w:jc w:val="both"/>
+              <w:jc w:val="left"/>
               <w:rPr>
                 <w:sz w:val="24"/>
                 <w:szCs w:val="24"/>
@@ -6161,7 +6296,7 @@
           </w:tcPr>
           <w:p>
             <w:pPr>
-              <w:jc w:val="both"/>
+              <w:jc w:val="left"/>
               <w:rPr>
                 <w:sz w:val="24"/>
                 <w:szCs w:val="24"/>
@@ -6179,6 +6314,7 @@
       </w:tr>
       <w:tr>
         <w:trPr>
+          <w:cantSplit/>
           <w:jc w:val="center"/>
         </w:trPr>
         <w:tc>
@@ -6250,7 +6386,7 @@
           </w:tcPr>
           <w:p>
             <w:pPr>
-              <w:jc w:val="both"/>
+              <w:jc w:val="left"/>
               <w:rPr>
                 <w:sz w:val="24"/>
                 <w:szCs w:val="24"/>
@@ -6278,7 +6414,7 @@
           </w:tcPr>
           <w:p>
             <w:pPr>
-              <w:jc w:val="both"/>
+              <w:jc w:val="left"/>
               <w:rPr>
                 <w:sz w:val="24"/>
                 <w:szCs w:val="24"/>
@@ -6306,7 +6442,7 @@
           </w:tcPr>
           <w:p>
             <w:pPr>
-              <w:jc w:val="both"/>
+              <w:jc w:val="left"/>
               <w:rPr>
                 <w:sz w:val="24"/>
                 <w:szCs w:val="24"/>
@@ -6324,6 +6460,7 @@
       </w:tr>
       <w:tr>
         <w:trPr>
+          <w:cantSplit/>
           <w:jc w:val="center"/>
         </w:trPr>
         <w:tc>
@@ -6395,7 +6532,7 @@
           </w:tcPr>
           <w:p>
             <w:pPr>
-              <w:jc w:val="both"/>
+              <w:jc w:val="left"/>
               <w:rPr>
                 <w:sz w:val="24"/>
                 <w:szCs w:val="24"/>
@@ -6423,7 +6560,7 @@
           </w:tcPr>
           <w:p>
             <w:pPr>
-              <w:jc w:val="both"/>
+              <w:jc w:val="left"/>
               <w:rPr>
                 <w:sz w:val="24"/>
                 <w:szCs w:val="24"/>
@@ -6451,7 +6588,7 @@
           </w:tcPr>
           <w:p>
             <w:pPr>
-              <w:jc w:val="both"/>
+              <w:jc w:val="left"/>
               <w:rPr>
                 <w:sz w:val="24"/>
                 <w:szCs w:val="24"/>
@@ -6469,6 +6606,7 @@
       </w:tr>
       <w:tr>
         <w:trPr>
+          <w:cantSplit/>
           <w:jc w:val="center"/>
         </w:trPr>
         <w:tc>
@@ -6540,7 +6678,7 @@
           </w:tcPr>
           <w:p>
             <w:pPr>
-              <w:jc w:val="both"/>
+              <w:jc w:val="left"/>
               <w:rPr>
                 <w:sz w:val="24"/>
                 <w:szCs w:val="24"/>
@@ -6568,7 +6706,7 @@
           </w:tcPr>
           <w:p>
             <w:pPr>
-              <w:jc w:val="both"/>
+              <w:jc w:val="left"/>
               <w:rPr>
                 <w:sz w:val="24"/>
                 <w:szCs w:val="24"/>
@@ -6596,7 +6734,7 @@
           </w:tcPr>
           <w:p>
             <w:pPr>
-              <w:jc w:val="both"/>
+              <w:jc w:val="left"/>
               <w:rPr>
                 <w:sz w:val="24"/>
                 <w:szCs w:val="24"/>
@@ -6614,6 +6752,7 @@
       </w:tr>
       <w:tr>
         <w:trPr>
+          <w:cantSplit/>
           <w:jc w:val="center"/>
         </w:trPr>
         <w:tc>
@@ -6685,7 +6824,7 @@
           </w:tcPr>
           <w:p>
             <w:pPr>
-              <w:jc w:val="both"/>
+              <w:jc w:val="left"/>
               <w:rPr>
                 <w:sz w:val="24"/>
                 <w:szCs w:val="24"/>
@@ -6713,7 +6852,7 @@
           </w:tcPr>
           <w:p>
             <w:pPr>
-              <w:jc w:val="both"/>
+              <w:jc w:val="left"/>
               <w:rPr>
                 <w:sz w:val="24"/>
                 <w:szCs w:val="24"/>
@@ -6741,7 +6880,7 @@
           </w:tcPr>
           <w:p>
             <w:pPr>
-              <w:jc w:val="both"/>
+              <w:jc w:val="left"/>
               <w:rPr>
                 <w:sz w:val="24"/>
                 <w:szCs w:val="24"/>
@@ -6759,6 +6898,7 @@
       </w:tr>
       <w:tr>
         <w:trPr>
+          <w:cantSplit/>
           <w:jc w:val="center"/>
         </w:trPr>
         <w:tc>
@@ -6830,7 +6970,7 @@
           </w:tcPr>
           <w:p>
             <w:pPr>
-              <w:jc w:val="both"/>
+              <w:jc w:val="left"/>
               <w:rPr>
                 <w:sz w:val="24"/>
                 <w:szCs w:val="24"/>
@@ -6858,7 +6998,7 @@
           </w:tcPr>
           <w:p>
             <w:pPr>
-              <w:jc w:val="both"/>
+              <w:jc w:val="left"/>
               <w:rPr>
                 <w:sz w:val="24"/>
                 <w:szCs w:val="24"/>
@@ -6886,7 +7026,7 @@
           </w:tcPr>
           <w:p>
             <w:pPr>
-              <w:jc w:val="both"/>
+              <w:jc w:val="left"/>
               <w:rPr>
                 <w:sz w:val="24"/>
                 <w:szCs w:val="24"/>
@@ -6904,6 +7044,7 @@
       </w:tr>
       <w:tr>
         <w:trPr>
+          <w:cantSplit/>
           <w:jc w:val="center"/>
         </w:trPr>
         <w:tc>
@@ -6975,7 +7116,7 @@
           </w:tcPr>
           <w:p>
             <w:pPr>
-              <w:jc w:val="both"/>
+              <w:jc w:val="left"/>
               <w:rPr>
                 <w:sz w:val="24"/>
                 <w:szCs w:val="24"/>
@@ -7003,7 +7144,7 @@
           </w:tcPr>
           <w:p>
             <w:pPr>
-              <w:jc w:val="both"/>
+              <w:jc w:val="left"/>
               <w:rPr>
                 <w:sz w:val="24"/>
                 <w:szCs w:val="24"/>
@@ -7031,7 +7172,7 @@
           </w:tcPr>
           <w:p>
             <w:pPr>
-              <w:jc w:val="both"/>
+              <w:jc w:val="left"/>
               <w:rPr>
                 <w:sz w:val="24"/>
                 <w:szCs w:val="24"/>
@@ -7049,6 +7190,7 @@
       </w:tr>
       <w:tr>
         <w:trPr>
+          <w:cantSplit/>
           <w:jc w:val="center"/>
         </w:trPr>
         <w:tc>
@@ -7120,7 +7262,7 @@
           </w:tcPr>
           <w:p>
             <w:pPr>
-              <w:jc w:val="both"/>
+              <w:jc w:val="left"/>
               <w:rPr>
                 <w:sz w:val="24"/>
                 <w:szCs w:val="24"/>
@@ -7148,7 +7290,7 @@
           </w:tcPr>
           <w:p>
             <w:pPr>
-              <w:jc w:val="both"/>
+              <w:jc w:val="left"/>
               <w:rPr>
                 <w:sz w:val="24"/>
                 <w:szCs w:val="24"/>
@@ -7176,7 +7318,7 @@
           </w:tcPr>
           <w:p>
             <w:pPr>
-              <w:jc w:val="both"/>
+              <w:jc w:val="left"/>
               <w:rPr>
                 <w:sz w:val="24"/>
                 <w:szCs w:val="24"/>
@@ -7194,6 +7336,7 @@
       </w:tr>
       <w:tr>
         <w:trPr>
+          <w:cantSplit/>
           <w:jc w:val="center"/>
         </w:trPr>
         <w:tc>
@@ -7265,7 +7408,7 @@
           </w:tcPr>
           <w:p>
             <w:pPr>
-              <w:jc w:val="both"/>
+              <w:jc w:val="left"/>
               <w:rPr>
                 <w:sz w:val="24"/>
                 <w:szCs w:val="24"/>
@@ -7293,7 +7436,7 @@
           </w:tcPr>
           <w:p>
             <w:pPr>
-              <w:jc w:val="both"/>
+              <w:jc w:val="left"/>
               <w:rPr>
                 <w:sz w:val="24"/>
                 <w:szCs w:val="24"/>
@@ -7321,7 +7464,7 @@
           </w:tcPr>
           <w:p>
             <w:pPr>
-              <w:jc w:val="both"/>
+              <w:jc w:val="left"/>
               <w:rPr>
                 <w:sz w:val="24"/>
                 <w:szCs w:val="24"/>
@@ -7377,6 +7520,7 @@
     </w:p>
     <w:p>
       <w:pPr>
+        <w:keepNext/>
         <w:pBdr>
           <w:top w:val="nil"/>
           <w:left w:val="nil"/>
@@ -7396,7 +7540,7 @@
           <w:sz w:val="24"/>
           <w:szCs w:val="24"/>
         </w:rPr>
-        <w:t xml:space="preserve">HRGA Officer menambah baris bila tingkatan di Tabel 1 lebih banyak dari baris yang tersedia.</w:t>
+        <w:t xml:space="preserve">Tambah baris jika jumlah tingkatan di Tabel 1 melebihi baris yang tersedia.</w:t>
       </w:r>
     </w:p>
     <w:tbl>
@@ -7416,6 +7560,8 @@
       </w:tblGrid>
       <w:tr>
         <w:trPr>
+          <w:cantSplit/>
+          <w:tblHeader/>
           <w:jc w:val="center"/>
         </w:trPr>
         <w:tc>
@@ -7431,6 +7577,7 @@
           </w:tcPr>
           <w:p>
             <w:pPr>
+              <w:keepNext/>
               <w:jc w:val="center"/>
               <w:rPr>
                 <w:sz w:val="24"/>
@@ -7461,6 +7608,7 @@
           </w:tcPr>
           <w:p>
             <w:pPr>
+              <w:keepNext/>
               <w:jc w:val="center"/>
               <w:rPr>
                 <w:sz w:val="24"/>
@@ -7491,6 +7639,7 @@
           </w:tcPr>
           <w:p>
             <w:pPr>
+              <w:keepNext/>
               <w:jc w:val="center"/>
               <w:rPr>
                 <w:sz w:val="24"/>
@@ -7521,6 +7670,7 @@
           </w:tcPr>
           <w:p>
             <w:pPr>
+              <w:keepNext/>
               <w:jc w:val="center"/>
               <w:rPr>
                 <w:sz w:val="24"/>
@@ -7541,7 +7691,9 @@
       </w:tr>
       <w:tr>
         <w:trPr>
+          <w:cantSplit/>
           <w:jc w:val="center"/>
+          <w:trHeight w:val="793" w:hRule="atLeast"/>
         </w:trPr>
         <w:tc>
           <w:tcPr>
@@ -7610,7 +7762,7 @@
           </w:tcPr>
           <w:p>
             <w:pPr>
-              <w:jc w:val="both"/>
+              <w:jc w:val="left"/>
               <w:rPr>
                 <w:sz w:val="24"/>
                 <w:szCs w:val="24"/>
@@ -7638,7 +7790,7 @@
           </w:tcPr>
           <w:p>
             <w:pPr>
-              <w:jc w:val="both"/>
+              <w:jc w:val="left"/>
               <w:rPr>
                 <w:sz w:val="24"/>
                 <w:szCs w:val="24"/>
@@ -7656,7 +7808,9 @@
       </w:tr>
       <w:tr>
         <w:trPr>
+          <w:cantSplit/>
           <w:jc w:val="center"/>
+          <w:trHeight w:val="793" w:hRule="atLeast"/>
         </w:trPr>
         <w:tc>
           <w:tcPr>
@@ -7725,7 +7879,7 @@
           </w:tcPr>
           <w:p>
             <w:pPr>
-              <w:jc w:val="both"/>
+              <w:jc w:val="left"/>
               <w:rPr>
                 <w:sz w:val="24"/>
                 <w:szCs w:val="24"/>
@@ -7753,7 +7907,7 @@
           </w:tcPr>
           <w:p>
             <w:pPr>
-              <w:jc w:val="both"/>
+              <w:jc w:val="left"/>
               <w:rPr>
                 <w:sz w:val="24"/>
                 <w:szCs w:val="24"/>
@@ -7771,7 +7925,9 @@
       </w:tr>
       <w:tr>
         <w:trPr>
+          <w:cantSplit/>
           <w:jc w:val="center"/>
+          <w:trHeight w:val="793" w:hRule="atLeast"/>
         </w:trPr>
         <w:tc>
           <w:tcPr>
@@ -7840,7 +7996,7 @@
           </w:tcPr>
           <w:p>
             <w:pPr>
-              <w:jc w:val="both"/>
+              <w:jc w:val="left"/>
               <w:rPr>
                 <w:sz w:val="24"/>
                 <w:szCs w:val="24"/>
@@ -7868,7 +8024,7 @@
           </w:tcPr>
           <w:p>
             <w:pPr>
-              <w:jc w:val="both"/>
+              <w:jc w:val="left"/>
               <w:rPr>
                 <w:sz w:val="24"/>
                 <w:szCs w:val="24"/>
@@ -7886,7 +8042,9 @@
       </w:tr>
       <w:tr>
         <w:trPr>
+          <w:cantSplit/>
           <w:jc w:val="center"/>
+          <w:trHeight w:val="793" w:hRule="atLeast"/>
         </w:trPr>
         <w:tc>
           <w:tcPr>
@@ -7955,7 +8113,7 @@
           </w:tcPr>
           <w:p>
             <w:pPr>
-              <w:jc w:val="both"/>
+              <w:jc w:val="left"/>
               <w:rPr>
                 <w:sz w:val="24"/>
                 <w:szCs w:val="24"/>
@@ -7983,7 +8141,7 @@
           </w:tcPr>
           <w:p>
             <w:pPr>
-              <w:jc w:val="both"/>
+              <w:jc w:val="left"/>
               <w:rPr>
                 <w:sz w:val="24"/>
                 <w:szCs w:val="24"/>
@@ -8001,7 +8159,9 @@
       </w:tr>
       <w:tr>
         <w:trPr>
+          <w:cantSplit/>
           <w:jc w:val="center"/>
+          <w:trHeight w:val="793" w:hRule="atLeast"/>
         </w:trPr>
         <w:tc>
           <w:tcPr>
@@ -8070,7 +8230,7 @@
           </w:tcPr>
           <w:p>
             <w:pPr>
-              <w:jc w:val="both"/>
+              <w:jc w:val="left"/>
               <w:rPr>
                 <w:sz w:val="24"/>
                 <w:szCs w:val="24"/>
@@ -8098,7 +8258,7 @@
           </w:tcPr>
           <w:p>
             <w:pPr>
-              <w:jc w:val="both"/>
+              <w:jc w:val="left"/>
               <w:rPr>
                 <w:sz w:val="24"/>
                 <w:szCs w:val="24"/>
@@ -8116,7 +8276,9 @@
       </w:tr>
       <w:tr>
         <w:trPr>
+          <w:cantSplit/>
           <w:jc w:val="center"/>
+          <w:trHeight w:val="793" w:hRule="atLeast"/>
         </w:trPr>
         <w:tc>
           <w:tcPr>
@@ -8185,7 +8347,7 @@
           </w:tcPr>
           <w:p>
             <w:pPr>
-              <w:jc w:val="both"/>
+              <w:jc w:val="left"/>
               <w:rPr>
                 <w:sz w:val="24"/>
                 <w:szCs w:val="24"/>
@@ -8213,7 +8375,7 @@
           </w:tcPr>
           <w:p>
             <w:pPr>
-              <w:jc w:val="both"/>
+              <w:jc w:val="left"/>
               <w:rPr>
                 <w:sz w:val="24"/>
                 <w:szCs w:val="24"/>
@@ -8257,6 +8419,7 @@
     <w:p>
       <w:pPr>
         <w:pStyle w:val="Heading1"/>
+        <w:keepNext/>
         <w:numPr>
           <w:ilvl w:val="0"/>
           <w:numId w:val="7"/>
@@ -8283,6 +8446,8 @@
       </w:tblGrid>
       <w:tr>
         <w:trPr>
+          <w:cantSplit/>
+          <w:tblHeader/>
           <w:jc w:val="center"/>
         </w:trPr>
         <w:tc>
@@ -8298,6 +8463,7 @@
           </w:tcPr>
           <w:p>
             <w:pPr>
+              <w:keepNext/>
               <w:jc w:val="center"/>
               <w:rPr>
                 <w:sz w:val="24"/>
@@ -8311,7 +8477,7 @@
                 <w:sz w:val="24"/>
                 <w:szCs w:val="24"/>
               </w:rPr>
-              <w:t>Rekaman</w:t>
+              <w:t>Record (rekaman)</w:t>
             </w:r>
           </w:p>
         </w:tc>
@@ -8328,6 +8494,7 @@
           </w:tcPr>
           <w:p>
             <w:pPr>
+              <w:keepNext/>
               <w:jc w:val="center"/>
               <w:rPr>
                 <w:sz w:val="24"/>
@@ -8358,6 +8525,7 @@
           </w:tcPr>
           <w:p>
             <w:pPr>
+              <w:keepNext/>
               <w:jc w:val="center"/>
               <w:rPr>
                 <w:sz w:val="24"/>
@@ -8378,6 +8546,7 @@
       </w:tr>
       <w:tr>
         <w:trPr>
+          <w:cantSplit/>
           <w:jc w:val="center"/>
         </w:trPr>
         <w:tc>
@@ -8449,7 +8618,7 @@
           </w:tcPr>
           <w:p>
             <w:pPr>
-              <w:jc w:val="both"/>
+              <w:jc w:val="left"/>
               <w:rPr>
                 <w:sz w:val="24"/>
                 <w:szCs w:val="24"/>
@@ -8506,6 +8675,7 @@
     </w:p>
     <w:p>
       <w:pPr>
+        <w:keepNext/>
         <w:pBdr>
           <w:top w:val="nil"/>
           <w:left w:val="nil"/>
@@ -8544,6 +8714,8 @@
       </w:tblGrid>
       <w:tr>
         <w:trPr>
+          <w:cantSplit/>
+          <w:tblHeader/>
           <w:jc w:val="center"/>
         </w:trPr>
         <w:tc>
@@ -8559,6 +8731,7 @@
           </w:tcPr>
           <w:p>
             <w:pPr>
+              <w:keepNext/>
               <w:jc w:val="center"/>
               <w:rPr>
                 <w:sz w:val="24"/>
@@ -8589,6 +8762,7 @@
           </w:tcPr>
           <w:p>
             <w:pPr>
+              <w:keepNext/>
               <w:jc w:val="center"/>
               <w:rPr>
                 <w:sz w:val="24"/>
@@ -8619,6 +8793,7 @@
           </w:tcPr>
           <w:p>
             <w:pPr>
+              <w:keepNext/>
               <w:jc w:val="center"/>
               <w:rPr>
                 <w:sz w:val="24"/>
@@ -8639,6 +8814,7 @@
       </w:tr>
       <w:tr>
         <w:trPr>
+          <w:cantSplit/>
           <w:jc w:val="center"/>
         </w:trPr>
         <w:tc>
@@ -8710,25 +8886,26 @@
           </w:tcPr>
           <w:p>
             <w:pPr>
-              <w:jc w:val="both"/>
-              <w:rPr>
-                <w:sz w:val="24"/>
-                <w:szCs w:val="24"/>
-              </w:rPr>
-            </w:pPr>
-            <w:r>
-              <w:rPr>
-                <w:b w:val="0"/>
-                <w:sz w:val="24"/>
-                <w:szCs w:val="24"/>
-              </w:rPr>
-              <w:t>Tabel 2 memuat kompetensi yang diperlukan pemegang jabatan. Penilaian kompetensi aktual, tindakan memperoleh kompetensi, dan bukti kompetensi pemegang jabatan berada di luar form ini.</w:t>
+              <w:jc w:val="left"/>
+              <w:rPr>
+                <w:sz w:val="24"/>
+                <w:szCs w:val="24"/>
+              </w:rPr>
+            </w:pPr>
+            <w:r>
+              <w:rPr>
+                <w:b w:val="0"/>
+                <w:sz w:val="24"/>
+                <w:szCs w:val="24"/>
+              </w:rPr>
+              <w:t>Tabel 2 memuat kompetensi yang diperlukan pemegang jabatan. Penilaian kompetensi aktual, tindakan untuk memperoleh kompetensi, dan bukti kompetensi pemegang jabatan berada di luar form ini.</w:t>
             </w:r>
           </w:p>
         </w:tc>
       </w:tr>
       <w:tr>
         <w:trPr>
+          <w:cantSplit/>
           <w:jc w:val="center"/>
         </w:trPr>
         <w:tc>
@@ -8800,7 +8977,7 @@
           </w:tcPr>
           <w:p>
             <w:pPr>
-              <w:jc w:val="both"/>
+              <w:jc w:val="left"/>
               <w:rPr>
                 <w:sz w:val="24"/>
                 <w:szCs w:val="24"/>
@@ -8819,6 +8996,7 @@
       </w:tr>
       <w:tr>
         <w:trPr>
+          <w:cantSplit/>
           <w:jc w:val="center"/>
         </w:trPr>
         <w:tc>
@@ -8890,19 +9068,19 @@
           </w:tcPr>
           <w:p>
             <w:pPr>
-              <w:jc w:val="both"/>
-              <w:rPr>
-                <w:sz w:val="24"/>
-                <w:szCs w:val="24"/>
-              </w:rPr>
-            </w:pPr>
-            <w:r>
-              <w:rPr>
-                <w:b w:val="0"/>
-                <w:sz w:val="24"/>
-                <w:szCs w:val="24"/>
-              </w:rPr>
-              <w:t>Kolom Pengetahuan dan Perilaku di Tabel 2 memuat standar keamanan informasi bila HR Lead menetapkannya.</w:t>
+              <w:jc w:val="left"/>
+              <w:rPr>
+                <w:sz w:val="24"/>
+                <w:szCs w:val="24"/>
+              </w:rPr>
+            </w:pPr>
+            <w:r>
+              <w:rPr>
+                <w:b w:val="0"/>
+                <w:sz w:val="24"/>
+                <w:szCs w:val="24"/>
+              </w:rPr>
+              <w:t>Kolom Pengetahuan dan Perilaku di Tabel 2 memuat standar keamanan informasi jika HR Lead menetapkannya.</w:t>
             </w:r>
           </w:p>
         </w:tc>
@@ -8935,6 +9113,7 @@
     <w:p>
       <w:pPr>
         <w:pStyle w:val="Heading1"/>
+        <w:keepNext/>
         <w:numPr>
           <w:ilvl w:val="0"/>
           <w:numId w:val="7"/>
@@ -8960,6 +9139,8 @@
       </w:tblGrid>
       <w:tr>
         <w:trPr>
+          <w:cantSplit/>
+          <w:tblHeader/>
           <w:jc w:val="center"/>
         </w:trPr>
         <w:tc>
@@ -8975,6 +9156,7 @@
           </w:tcPr>
           <w:p>
             <w:pPr>
+              <w:keepNext/>
               <w:jc w:val="center"/>
               <w:rPr>
                 <w:sz w:val="24"/>
@@ -9005,6 +9187,7 @@
           </w:tcPr>
           <w:p>
             <w:pPr>
+              <w:keepNext/>
               <w:jc w:val="center"/>
               <w:rPr>
                 <w:sz w:val="24"/>
@@ -9025,6 +9208,7 @@
       </w:tr>
       <w:tr>
         <w:trPr>
+          <w:cantSplit/>
           <w:jc w:val="center"/>
         </w:trPr>
         <w:tc>
@@ -9086,6 +9270,7 @@
       </w:tr>
       <w:tr>
         <w:trPr>
+          <w:cantSplit/>
           <w:jc w:val="center"/>
         </w:trPr>
         <w:tc>
@@ -9140,13 +9325,14 @@
                 <w:sz w:val="24"/>
                 <w:szCs w:val="24"/>
               </w:rPr>
-              <w:t>Job Analysis dan Uraian Jabatan: sumber kompetensi teknis dan kompetensi perilaku tiap jabatan (butir 4.1 dan 7.6). Menurut butir 4.7 dokumen itu, sertifikasi wajib hanya bila ditetapkan di Competency Matrix atau bila kontrak pelanggan memuat persyaratannya; form ini dibaca sebagai Competency Matrix itu (USULAN).</w:t>
+              <w:t>Job Analysis dan Uraian Jabatan: sumber kompetensi teknis dan perilaku tiap jabatan. Butir 4.7 dokumen itu mewajibkan sertifikasi hanya jika ditetapkan di Competency Matrix atau dipersyaratkan kontrak pelanggan; form ini diperlakukan sebagai Competency Matrix tersebut (USULAN).</w:t>
             </w:r>
           </w:p>
         </w:tc>
       </w:tr>
       <w:tr>
         <w:trPr>
+          <w:cantSplit/>
           <w:jc w:val="center"/>
         </w:trPr>
         <w:tc>
@@ -9201,13 +9387,14 @@
                 <w:sz w:val="24"/>
                 <w:szCs w:val="24"/>
               </w:rPr>
-              <w:t>Promotion: bila form ini disahkan, HR Lead memakainya sebagai acuan tambahan penilaian kualifikasi (USULAN).</w:t>
+              <w:t>Promotion: jika form ini disahkan, HR Lead memakainya sebagai acuan tambahan dalam menilai kualifikasi (USULAN).</w:t>
             </w:r>
           </w:p>
         </w:tc>
       </w:tr>
       <w:tr>
         <w:trPr>
+          <w:cantSplit/>
           <w:jc w:val="center"/>
         </w:trPr>
         <w:tc>
@@ -9262,13 +9449,14 @@
                 <w:sz w:val="24"/>
                 <w:szCs w:val="24"/>
               </w:rPr>
-              <w:t>Rotation: bagian 3 dokumen itu memuat ukuran tingkatan jabatan yang dipakai butir 4.3. Bila form ini disahkan dan memuat tingkatan jabatan, HR Lead memakai tingkatan itu pada butir 4.2 dokumen itu (USULAN).</w:t>
+              <w:t>Rotation: sumber ukuran tingkatan jabatan di form ini. Jika form ini disahkan dan sudah memuat tingkatan jabatan, HR Lead memakai tingkatan itu pada butir 4.2 dokumen itu (USULAN).</w:t>
             </w:r>
           </w:p>
         </w:tc>
       </w:tr>
       <w:tr>
         <w:trPr>
+          <w:cantSplit/>
           <w:jc w:val="center"/>
         </w:trPr>
         <w:tc>
@@ -9330,6 +9518,7 @@
       </w:tr>
       <w:tr>
         <w:trPr>
+          <w:cantSplit/>
           <w:jc w:val="center"/>
         </w:trPr>
         <w:tc>
@@ -9384,13 +9573,14 @@
                 <w:sz w:val="24"/>
                 <w:szCs w:val="24"/>
               </w:rPr>
-              <w:t>Information Classification &amp; Handling Procedure: tingkat klasifikasi RESTRICTED (Internal) untuk form ini (butir 4.6).</w:t>
+              <w:t>Information Classification &amp; Handling Procedure: dasar klasifikasi RESTRICTED (Internal) form ini.</w:t>
             </w:r>
           </w:p>
         </w:tc>
       </w:tr>
       <w:tr>
         <w:trPr>
+          <w:cantSplit/>
           <w:jc w:val="center"/>
         </w:trPr>
         <w:tc>
@@ -9509,7 +9699,7 @@
           <w:sz w:val="24"/>
           <w:szCs w:val="24"/>
         </w:rPr>
-        <w:t xml:space="preserve">Form ini berstatus Draft, dan baru dipakai sebagai standar sesudah HR Lead menetapkan isi Tabel 1 dan Tabel 2 dan Direktur Utama menandatangani blok Approved By.</w:t>
+        <w:t xml:space="preserve">Form ini berstatus Draft. Form baru dipakai sebagai standar setelah HR Lead menetapkan isi Tabel 1 dan Tabel 2, lalu Direktur Utama menandatangani blok Approved By.</w:t>
       </w:r>
     </w:p>
     <w:p>
@@ -9533,7 +9723,7 @@
           <w:sz w:val="24"/>
           <w:szCs w:val="24"/>
         </w:rPr>
-        <w:t xml:space="preserve">HR Lead meninjau form ini setiap tahun, dan lebih awal bila SNX-HR-ORG-01 atau SNX-HR-JA-01 berubah (USULAN).</w:t>
+        <w:t xml:space="preserve">HR Lead meninjau form ini setiap tahun, atau lebih awal jika SNX-HR-ORG-01 atau SNX-HR-JA-01 berubah (USULAN).</w:t>
       </w:r>
     </w:p>
     <w:sectPr>

</xml_diff>